<commit_message>
feat(auth): validate local login form and document flow
</commit_message>
<xml_diff>
--- a/docs/Nexo-Frontend-Azure-Step-by-Step.docx
+++ b/docs/Nexo-Frontend-Azure-Step-by-Step.docx
@@ -25,7 +25,7 @@
           <w:color w:val="293E78"/>
           <w:sz w:val="40"/>
         </w:rPr>
-        <w:t>Configuración del frontend y Microsoft Entra ID</w:t>
+        <w:t>Autenticación Nexo: registro, login y Microsoft Entra ID</w:t>
       </w:r>
     </w:p>
     <w:p>
@@ -47,7 +47,7 @@
         <w:t xml:space="preserve">Alcance. </w:t>
       </w:r>
       <w:r>
-        <w:t>Este informe documenta la configuración del frontend Angular de Nexo, sus registros de Microsoft Entra ID, el redirect URI local, el scope de API y la limpieza de las aplicaciones antiguas de Pedidos360. No contiene secretos ni credenciales privadas.</w:t>
+        <w:t>Este informe documenta el login local con correo y contraseña, el registro de usuarios, la validación de Microsoft Entra ID, la persistencia en PostgreSQL y las evidencias visuales. La cuenta usada en las pruebas es del entorno local; la contraseña no se documenta.</w:t>
       </w:r>
     </w:p>
     <w:p>
@@ -571,16 +571,177 @@
     </w:p>
     <w:p>
       <w:pPr>
+        <w:jc w:val="center"/>
+      </w:pPr>
+      <w:r>
+        <w:drawing>
+          <wp:inline xmlns:a="http://schemas.openxmlformats.org/drawingml/2006/main" xmlns:pic="http://schemas.openxmlformats.org/drawingml/2006/picture">
+            <wp:extent cx="5897880" cy="3316690"/>
+            <wp:docPr id="5" name="Picture 5"/>
+            <wp:cNvGraphicFramePr>
+              <a:graphicFrameLocks noChangeAspect="1"/>
+            </wp:cNvGraphicFramePr>
+            <a:graphic>
+              <a:graphicData uri="http://schemas.openxmlformats.org/drawingml/2006/picture">
+                <pic:pic>
+                  <pic:nvPicPr>
+                    <pic:cNvPr id="0" name="05-login-validation-errors.png"/>
+                    <pic:cNvPicPr/>
+                  </pic:nvPicPr>
+                  <pic:blipFill>
+                    <a:blip r:embed="rId13"/>
+                    <a:stretch>
+                      <a:fillRect/>
+                    </a:stretch>
+                  </pic:blipFill>
+                  <pic:spPr>
+                    <a:xfrm>
+                      <a:off x="0" y="0"/>
+                      <a:ext cx="5897880" cy="3316690"/>
+                    </a:xfrm>
+                    <a:prstGeom prst="rect"/>
+                  </pic:spPr>
+                </pic:pic>
+              </a:graphicData>
+            </a:graphic>
+          </wp:inline>
+        </w:drawing>
+      </w:r>
+    </w:p>
+    <w:p>
+      <w:pPr>
+        <w:jc w:val="center"/>
+      </w:pPr>
+      <w:r>
+        <w:rPr>
+          <w:i/>
+          <w:color w:val="595959"/>
+          <w:sz w:val="18"/>
+        </w:rPr>
+        <w:t>Validación en línea: correo con formato incorrecto y contraseña menor a 8 caracteres.</w:t>
+      </w:r>
+    </w:p>
+    <w:p>
+      <w:pPr>
+        <w:jc w:val="center"/>
+      </w:pPr>
+      <w:r>
+        <w:drawing>
+          <wp:inline xmlns:a="http://schemas.openxmlformats.org/drawingml/2006/main" xmlns:pic="http://schemas.openxmlformats.org/drawingml/2006/picture">
+            <wp:extent cx="5897880" cy="3316690"/>
+            <wp:docPr id="6" name="Picture 6"/>
+            <wp:cNvGraphicFramePr>
+              <a:graphicFrameLocks noChangeAspect="1"/>
+            </wp:cNvGraphicFramePr>
+            <a:graphic>
+              <a:graphicData uri="http://schemas.openxmlformats.org/drawingml/2006/picture">
+                <pic:pic>
+                  <pic:nvPicPr>
+                    <pic:cNvPr id="0" name="06-login-success.png"/>
+                    <pic:cNvPicPr/>
+                  </pic:nvPicPr>
+                  <pic:blipFill>
+                    <a:blip r:embed="rId14"/>
+                    <a:stretch>
+                      <a:fillRect/>
+                    </a:stretch>
+                  </pic:blipFill>
+                  <pic:spPr>
+                    <a:xfrm>
+                      <a:off x="0" y="0"/>
+                      <a:ext cx="5897880" cy="3316690"/>
+                    </a:xfrm>
+                    <a:prstGeom prst="rect"/>
+                  </pic:spPr>
+                </pic:pic>
+              </a:graphicData>
+            </a:graphic>
+          </wp:inline>
+        </w:drawing>
+      </w:r>
+    </w:p>
+    <w:p>
+      <w:pPr>
+        <w:jc w:val="center"/>
+      </w:pPr>
+      <w:r>
+        <w:rPr>
+          <w:i/>
+          <w:color w:val="595959"/>
+          <w:sz w:val="18"/>
+        </w:rPr>
+        <w:t>Login local exitoso: redirección a /home y datos del usuario autenticado.</w:t>
+      </w:r>
+    </w:p>
+    <w:p>
+      <w:pPr>
         <w:pStyle w:val="Heading1"/>
         <w:spacing w:before="240" w:after="120"/>
       </w:pPr>
       <w:r>
-        <w:t>4. Cambios en el frontend</w:t>
+        <w:t>4. Flujo de registro y login</w:t>
+      </w:r>
+    </w:p>
+    <w:p>
+      <w:pPr>
+        <w:pStyle w:val="ListNumber"/>
+      </w:pPr>
+      <w:r>
+        <w:t>En /login, el usuario puede continuar con Microsoft o alternar al formulario de correo.</w:t>
+      </w:r>
+    </w:p>
+    <w:p>
+      <w:pPr>
+        <w:pStyle w:val="ListNumber"/>
+      </w:pPr>
+      <w:r>
+        <w:t>El registro exige nombre, correo válido y contraseña de mínimo 8 caracteres. Los errores aparecen debajo del campo y el botón no envía formularios inválidos.</w:t>
+      </w:r>
+    </w:p>
+    <w:p>
+      <w:pPr>
+        <w:pStyle w:val="ListNumber"/>
+      </w:pPr>
+      <w:r>
+        <w:t>El backend vuelve a validar el payload con Bean Validation, verifica que el correo no esté registrado y genera un JWT local al crear la cuenta.</w:t>
+      </w:r>
+    </w:p>
+    <w:p>
+      <w:pPr>
+        <w:pStyle w:val="ListNumber"/>
+      </w:pPr>
+      <w:r>
+        <w:t>El login compara la contraseña recibida contra el hash BCrypt almacenado y entrega un JWT con issuer nexo-local y audience nexo-api.</w:t>
+      </w:r>
+    </w:p>
+    <w:p>
+      <w:pPr>
+        <w:pStyle w:val="ListNumber"/>
+      </w:pPr>
+      <w:r>
+        <w:t>El interceptor adjunta Authorization: Bearer &lt;JWT&gt; a /api/users/me; la guarda permite /home solo con sesión válida.</w:t>
+      </w:r>
+    </w:p>
+    <w:p>
+      <w:pPr>
+        <w:pStyle w:val="ListNumber"/>
+      </w:pPr>
+      <w:r>
+        <w:t>Microsoft Entra mantiene el flujo OAuth2/OIDC; sus tokens se validan con issuer, audience, firma y expiración mediante el Resource Server.</w:t>
+      </w:r>
+    </w:p>
+    <w:p>
+      <w:pPr>
+        <w:pStyle w:val="Heading1"/>
+        <w:spacing w:before="240" w:after="120"/>
+      </w:pPr>
+      <w:r>
+        <w:t>5. Cambios en el frontend</w:t>
       </w:r>
     </w:p>
     <w:p>
       <w:r>
-        <w:t>El frontend incluye MSAL con @azure/msal-angular y @azure/msal-browser, guardas de navegación, interceptor Authorization Bearer, login/logout con Microsoft y las rutas /login, /home y /profile.</w:t>
+        <w:t>El frontend incluye formularios reactivos, validación visual accesible, interceptor para JWT local, interceptor MSAL condicionado a cuentas Microsoft, guardas compatibles con ambos métodos y las rutas /login, /home y /profile.</w:t>
       </w:r>
     </w:p>
     <w:p>
@@ -599,7 +760,26 @@
         <w:spacing w:before="240" w:after="120"/>
       </w:pPr>
       <w:r>
-        <w:t>5. Verificaciones ejecutadas</w:t>
+        <w:t>6. Persistencia y seguridad de datos</w:t>
+      </w:r>
+    </w:p>
+    <w:p>
+      <w:r>
+        <w:t>La migración V5 agrega password_hash y permite identity_provider=LOCAL. La migración V6 elimina la restricción histórica incompatible con usuarios locales. La tabla nexo.users conserva el email, username, display_name, estado y timestamps; password_hash contiene únicamente un hash BCrypt y nunca la contraseña original.</w:t>
+      </w:r>
+    </w:p>
+    <w:p>
+      <w:r>
+        <w:t>Consulta de verificación ejecutada en PostgreSQL: SELECT email, identity_provider, password_hash IS NOT NULL FROM nexo.users WHERE lower(email) = 'jor.vergaras@duocuc.cl'; Resultado: usuario LOCAL y hash presente. No se registran contraseñas en logs ni en el documento.</w:t>
+      </w:r>
+    </w:p>
+    <w:p>
+      <w:pPr>
+        <w:pStyle w:val="Heading1"/>
+        <w:spacing w:before="240" w:after="120"/>
+      </w:pPr>
+      <w:r>
+        <w:t>7. Verificaciones ejecutadas</w:t>
       </w:r>
     </w:p>
     <w:tbl>
@@ -726,7 +906,7 @@
               <w:rPr>
                 <w:b w:val="0"/>
               </w:rPr>
-              <w:t>Pruebas frontend</w:t>
+              <w:t>Compilación backend</w:t>
             </w:r>
           </w:p>
         </w:tc>
@@ -741,7 +921,7 @@
               <w:rPr>
                 <w:b w:val="0"/>
               </w:rPr>
-              <w:t>npm run test:ci</w:t>
+              <w:t>backend/mvnw.cmd -DskipTests compile</w:t>
             </w:r>
           </w:p>
         </w:tc>
@@ -756,7 +936,7 @@
               <w:rPr>
                 <w:b w:val="0"/>
               </w:rPr>
-              <w:t>24 tests passed</w:t>
+              <w:t>OK con Java 21</w:t>
             </w:r>
           </w:p>
         </w:tc>
@@ -803,7 +983,148 @@
               <w:rPr>
                 <w:b w:val="0"/>
               </w:rPr>
-              <w:t>OK; warning budget inicial MSAL 526.25 kB / 500 kB</w:t>
+              <w:t>OK; warning de presupuesto inicial por MSAL</w:t>
+            </w:r>
+          </w:p>
+        </w:tc>
+      </w:tr>
+      <w:tr>
+        <w:tc>
+          <w:tcPr>
+            <w:tcW w:type="dxa" w:w="3360"/>
+            <w:vAlign w:val="center"/>
+          </w:tcPr>
+          <w:p>
+            <w:r/>
+            <w:r>
+              <w:rPr>
+                <w:b w:val="0"/>
+              </w:rPr>
+              <w:t>Prueba API registro/login</w:t>
+            </w:r>
+          </w:p>
+        </w:tc>
+        <w:tc>
+          <w:tcPr>
+            <w:tcW w:type="dxa" w:w="3360"/>
+            <w:vAlign w:val="center"/>
+          </w:tcPr>
+          <w:p>
+            <w:r/>
+            <w:r>
+              <w:rPr>
+                <w:b w:val="0"/>
+              </w:rPr>
+              <w:t>POST /api/auth/register y POST /api/auth/login</w:t>
+            </w:r>
+          </w:p>
+        </w:tc>
+        <w:tc>
+          <w:tcPr>
+            <w:tcW w:type="dxa" w:w="3360"/>
+            <w:vAlign w:val="center"/>
+          </w:tcPr>
+          <w:p>
+            <w:r/>
+            <w:r>
+              <w:rPr>
+                <w:b w:val="0"/>
+              </w:rPr>
+              <w:t>OK; JWT emitido</w:t>
+            </w:r>
+          </w:p>
+        </w:tc>
+      </w:tr>
+      <w:tr>
+        <w:tc>
+          <w:tcPr>
+            <w:tcW w:type="dxa" w:w="3360"/>
+            <w:vAlign w:val="center"/>
+          </w:tcPr>
+          <w:p>
+            <w:r/>
+            <w:r>
+              <w:rPr>
+                <w:b w:val="0"/>
+              </w:rPr>
+              <w:t>Prueba protegida</w:t>
+            </w:r>
+          </w:p>
+        </w:tc>
+        <w:tc>
+          <w:tcPr>
+            <w:tcW w:type="dxa" w:w="3360"/>
+            <w:vAlign w:val="center"/>
+          </w:tcPr>
+          <w:p>
+            <w:r/>
+            <w:r>
+              <w:rPr>
+                <w:b w:val="0"/>
+              </w:rPr>
+              <w:t>GET /api/users/me con Bearer JWT</w:t>
+            </w:r>
+          </w:p>
+        </w:tc>
+        <w:tc>
+          <w:tcPr>
+            <w:tcW w:type="dxa" w:w="3360"/>
+            <w:vAlign w:val="center"/>
+          </w:tcPr>
+          <w:p>
+            <w:r/>
+            <w:r>
+              <w:rPr>
+                <w:b w:val="0"/>
+              </w:rPr>
+              <w:t>200; usuario persistido</w:t>
+            </w:r>
+          </w:p>
+        </w:tc>
+      </w:tr>
+      <w:tr>
+        <w:tc>
+          <w:tcPr>
+            <w:tcW w:type="dxa" w:w="3360"/>
+            <w:vAlign w:val="center"/>
+          </w:tcPr>
+          <w:p>
+            <w:r/>
+            <w:r>
+              <w:rPr>
+                <w:b w:val="0"/>
+              </w:rPr>
+              <w:t>Prueba visual</w:t>
+            </w:r>
+          </w:p>
+        </w:tc>
+        <w:tc>
+          <w:tcPr>
+            <w:tcW w:type="dxa" w:w="3360"/>
+            <w:vAlign w:val="center"/>
+          </w:tcPr>
+          <w:p>
+            <w:r/>
+            <w:r>
+              <w:rPr>
+                <w:b w:val="0"/>
+              </w:rPr>
+              <w:t>Navegador local</w:t>
+            </w:r>
+          </w:p>
+        </w:tc>
+        <w:tc>
+          <w:tcPr>
+            <w:tcW w:type="dxa" w:w="3360"/>
+            <w:vAlign w:val="center"/>
+          </w:tcPr>
+          <w:p>
+            <w:r/>
+            <w:r>
+              <w:rPr>
+                <w:b w:val="0"/>
+              </w:rPr>
+              <w:t>OK; errores y redirección /home verificados</w:t>
             </w:r>
           </w:p>
         </w:tc>
@@ -815,16 +1136,16 @@
         <w:spacing w:before="240" w:after="120"/>
       </w:pPr>
       <w:r>
-        <w:t>6. Observación de integración</w:t>
+        <w:t>8. Ejecución local</w:t>
       </w:r>
     </w:p>
     <w:p>
       <w:r>
-        <w:t>El login MSAL del navegador ya está configurado con los identificadores de Azure. Para completar una prueba end-to-end contra /api/users/me, el backend debe validar tokens de Microsoft Entra como OAuth2 Resource Server y aceptar el audience del API Nexo. Esa parte corresponde al módulo backend y no se modificó en este encargo frontend.</w:t>
+        <w:t>1) Iniciar PostgreSQL: docker compose up -d. 2) Iniciar backend: backend\mvnw.cmd spring-boot:run. 3) Iniciar frontend: npm start. 4) Abrir http://127.0.0.1:4200/login. 5) Para Microsoft, completar el consentimiento de la API Nexo en el tenant si Azure lo solicita.</w:t>
       </w:r>
     </w:p>
     <w:sectPr>
-      <w:footerReference w:type="default" r:id="rId13"/>
+      <w:footerReference w:type="default" r:id="rId15"/>
       <w:pgSz w:w="12240" w:h="15840"/>
       <w:pgMar w:top="936" w:right="1080" w:bottom="936" w:left="1080" w:header="720" w:footer="720" w:gutter="0"/>
       <w:cols w:space="720"/>

</xml_diff>

<commit_message>
docs(auth): add refreshed login and msal evidence
</commit_message>
<xml_diff>
--- a/docs/Nexo-Frontend-Azure-Step-by-Step.docx
+++ b/docs/Nexo-Frontend-Azure-Step-by-Step.docx
@@ -1144,6 +1144,263 @@
         <w:t>1) Iniciar PostgreSQL: docker compose up -d. 2) Iniciar backend: backend\mvnw.cmd spring-boot:run. 3) Iniciar frontend: npm start. 4) Abrir http://127.0.0.1:4200/login. 5) Para Microsoft, completar el consentimiento de la API Nexo en el tenant si Azure lo solicita.</w:t>
       </w:r>
     </w:p>
+    <w:p>
+      <w:r>
+        <w:br w:type="page"/>
+      </w:r>
+    </w:p>
+    <w:p>
+      <w:pPr>
+        <w:pStyle w:val="Heading1"/>
+      </w:pPr>
+      <w:r>
+        <w:rPr>
+          <w:color w:val="4F46E5"/>
+        </w:rPr>
+        <w:t>Evidencia actualizada: login y token MSAL</w:t>
+      </w:r>
+    </w:p>
+    <w:p>
+      <w:r>
+        <w:rPr>
+          <w:b/>
+        </w:rPr>
+        <w:t xml:space="preserve">Objetivo. </w:t>
+      </w:r>
+      <w:r>
+        <w:t>Comprobar el flujo de acceso local y dejar documentado cómo Microsoft Entra ID entrega el Access Token JWT que el frontend adjunta a la API.</w:t>
+      </w:r>
+    </w:p>
+    <w:p>
+      <w:pPr>
+        <w:pStyle w:val="Heading2"/>
+      </w:pPr>
+      <w:r>
+        <w:t>1. Pantalla de sesión expirada</w:t>
+      </w:r>
+    </w:p>
+    <w:p>
+      <w:r>
+        <w:t>El parámetro reason=expired aparece cuando una sesión Microsoft anterior ya no es válida. No corresponde a un error de registro local: se debe iniciar nuevamente el flujo OAuth.</w:t>
+      </w:r>
+    </w:p>
+    <w:p>
+      <w:r>
+        <w:drawing>
+          <wp:inline xmlns:a="http://schemas.openxmlformats.org/drawingml/2006/main" xmlns:pic="http://schemas.openxmlformats.org/drawingml/2006/picture">
+            <wp:extent cx="5577840" cy="6611571"/>
+            <wp:docPr id="7" name="Picture 7"/>
+            <wp:cNvGraphicFramePr>
+              <a:graphicFrameLocks noChangeAspect="1"/>
+            </wp:cNvGraphicFramePr>
+            <a:graphic>
+              <a:graphicData uri="http://schemas.openxmlformats.org/drawingml/2006/picture">
+                <pic:pic>
+                  <pic:nvPicPr>
+                    <pic:cNvPr id="0" name="07-session-expired-msal.png"/>
+                    <pic:cNvPicPr/>
+                  </pic:nvPicPr>
+                  <pic:blipFill>
+                    <a:blip r:embed="rId16"/>
+                    <a:stretch>
+                      <a:fillRect/>
+                    </a:stretch>
+                  </pic:blipFill>
+                  <pic:spPr>
+                    <a:xfrm>
+                      <a:off x="0" y="0"/>
+                      <a:ext cx="5577840" cy="6611571"/>
+                    </a:xfrm>
+                    <a:prstGeom prst="rect"/>
+                  </pic:spPr>
+                </pic:pic>
+              </a:graphicData>
+            </a:graphic>
+          </wp:inline>
+        </w:drawing>
+      </w:r>
+    </w:p>
+    <w:p>
+      <w:pPr>
+        <w:jc w:val="center"/>
+      </w:pPr>
+      <w:r>
+        <w:t>Figura 1. Pantalla Nexo mostrando la sesión Microsoft expirada.</w:t>
+      </w:r>
+    </w:p>
+    <w:p>
+      <w:pPr>
+        <w:pStyle w:val="Heading2"/>
+      </w:pPr>
+      <w:r>
+        <w:t>2. Login local y validaciones</w:t>
+      </w:r>
+    </w:p>
+    <w:p>
+      <w:r>
+        <w:t>El formulario valida correo electrónico y contraseña antes de enviar la solicitud. La contraseña debe tener al menos 8 caracteres. Si las credenciales no coinciden, se muestra el mensaje ‘Correo o contraseña incorrectos.’ debajo del formulario.</w:t>
+      </w:r>
+    </w:p>
+    <w:p>
+      <w:r>
+        <w:drawing>
+          <wp:inline xmlns:a="http://schemas.openxmlformats.org/drawingml/2006/main" xmlns:pic="http://schemas.openxmlformats.org/drawingml/2006/picture">
+            <wp:extent cx="5577840" cy="3136715"/>
+            <wp:docPr id="8" name="Picture 8"/>
+            <wp:cNvGraphicFramePr>
+              <a:graphicFrameLocks noChangeAspect="1"/>
+            </wp:cNvGraphicFramePr>
+            <a:graphic>
+              <a:graphicData uri="http://schemas.openxmlformats.org/drawingml/2006/picture">
+                <pic:pic>
+                  <pic:nvPicPr>
+                    <pic:cNvPr id="0" name="image.jpg"/>
+                    <pic:cNvPicPr/>
+                  </pic:nvPicPr>
+                  <pic:blipFill>
+                    <a:blip r:embed="rId13"/>
+                    <a:stretch>
+                      <a:fillRect/>
+                    </a:stretch>
+                  </pic:blipFill>
+                  <pic:spPr>
+                    <a:xfrm>
+                      <a:off x="0" y="0"/>
+                      <a:ext cx="5577840" cy="3136715"/>
+                    </a:xfrm>
+                    <a:prstGeom prst="rect"/>
+                  </pic:spPr>
+                </pic:pic>
+              </a:graphicData>
+            </a:graphic>
+          </wp:inline>
+        </w:drawing>
+      </w:r>
+    </w:p>
+    <w:p>
+      <w:pPr>
+        <w:jc w:val="center"/>
+      </w:pPr>
+      <w:r>
+        <w:t>Figura 2. Validación y mensaje de error del formulario.</w:t>
+      </w:r>
+    </w:p>
+    <w:p>
+      <w:r>
+        <w:drawing>
+          <wp:inline xmlns:a="http://schemas.openxmlformats.org/drawingml/2006/main" xmlns:pic="http://schemas.openxmlformats.org/drawingml/2006/picture">
+            <wp:extent cx="5577840" cy="3136715"/>
+            <wp:docPr id="9" name="Picture 9"/>
+            <wp:cNvGraphicFramePr>
+              <a:graphicFrameLocks noChangeAspect="1"/>
+            </wp:cNvGraphicFramePr>
+            <a:graphic>
+              <a:graphicData uri="http://schemas.openxmlformats.org/drawingml/2006/picture">
+                <pic:pic>
+                  <pic:nvPicPr>
+                    <pic:cNvPr id="0" name="image.jpg"/>
+                    <pic:cNvPicPr/>
+                  </pic:nvPicPr>
+                  <pic:blipFill>
+                    <a:blip r:embed="rId14"/>
+                    <a:stretch>
+                      <a:fillRect/>
+                    </a:stretch>
+                  </pic:blipFill>
+                  <pic:spPr>
+                    <a:xfrm>
+                      <a:off x="0" y="0"/>
+                      <a:ext cx="5577840" cy="3136715"/>
+                    </a:xfrm>
+                    <a:prstGeom prst="rect"/>
+                  </pic:spPr>
+                </pic:pic>
+              </a:graphicData>
+            </a:graphic>
+          </wp:inline>
+        </w:drawing>
+      </w:r>
+    </w:p>
+    <w:p>
+      <w:pPr>
+        <w:jc w:val="center"/>
+      </w:pPr>
+      <w:r>
+        <w:t>Figura 3. Login local exitoso con sesión persistida en el navegador.</w:t>
+      </w:r>
+    </w:p>
+    <w:p>
+      <w:pPr>
+        <w:pStyle w:val="Heading2"/>
+      </w:pPr>
+      <w:r>
+        <w:t>3. ¿Cómo se refleja MSAL y el JWT?</w:t>
+      </w:r>
+    </w:p>
+    <w:p>
+      <w:r>
+        <w:t>El usuario pulsa ‘Continuar con Microsoft’. AuthService inicializa PublicClientApplication y ejecuta loginRedirect con el scope de Nexo. Microsoft Entra ID autentica al usuario y devuelve un resultado de autenticación. MSAL conserva la cuenta en sessionStorage; el token no se muestra completo en la interfaz ni se registra en el repositorio.</w:t>
+      </w:r>
+    </w:p>
+    <w:p>
+      <w:pPr>
+        <w:spacing w:after="160"/>
+      </w:pPr>
+      <w:r>
+        <w:rPr>
+          <w:b/>
+        </w:rPr>
+        <w:t xml:space="preserve">Flujo comprobable: </w:t>
+      </w:r>
+      <w:r>
+        <w:t>LoginComponent → AuthService → MSAL loginRedirect → Entra ID → Access Token JWT → MsalAuthInterceptor → Authorization: Bearer &lt;JWT&gt; → GET /api/users/me.</w:t>
+      </w:r>
+    </w:p>
+    <w:p>
+      <w:r>
+        <w:t>El interceptor solicita el token mediante acquireTokenSilent para la API configurada. Spring Boot valida la firma, issuer, audience y expiración; después /api/users/me sincroniza el usuario autenticado con PostgreSQL. Para evidencias o presentaciones se debe mostrar el encabezado redactado ‘Bearer eyJ...&lt;redactado&gt;’, nunca un token real completo.</w:t>
+      </w:r>
+    </w:p>
+    <w:p>
+      <w:pPr>
+        <w:pStyle w:val="Heading2"/>
+      </w:pPr>
+      <w:r>
+        <w:t>4. Resultado de las pruebas</w:t>
+      </w:r>
+    </w:p>
+    <w:p>
+      <w:pPr>
+        <w:pStyle w:val="ListBullet"/>
+      </w:pPr>
+      <w:r>
+        <w:t>Frontend: npm run build exitoso; 24/24 pruebas aprobadas.</w:t>
+      </w:r>
+    </w:p>
+    <w:p>
+      <w:pPr>
+        <w:pStyle w:val="ListBullet"/>
+      </w:pPr>
+      <w:r>
+        <w:t>Backend: 16/16 pruebas aprobadas; health, login local y /api/users/me verificados.</w:t>
+      </w:r>
+    </w:p>
+    <w:p>
+      <w:pPr>
+        <w:pStyle w:val="ListBullet"/>
+      </w:pPr>
+      <w:r>
+        <w:t>Azure: scope access_as_user habilitado y aplicación frontend autorizada.</w:t>
+      </w:r>
+    </w:p>
+    <w:p>
+      <w:pPr>
+        <w:pStyle w:val="ListBullet"/>
+      </w:pPr>
+      <w:r>
+        <w:t>Pendiente manual: completar contraseña y MFA de Microsoft para verificar el retorno real desde Entra ID.</w:t>
+      </w:r>
+    </w:p>
     <w:sectPr>
       <w:footerReference w:type="default" r:id="rId15"/>
       <w:pgSz w:w="12240" w:h="15840"/>

</xml_diff>

<commit_message>
docs: agregar galeria visual de MSAL y JWT
</commit_message>
<xml_diff>
--- a/docs/Nexo-Frontend-Azure-Step-by-Step.docx
+++ b/docs/Nexo-Frontend-Azure-Step-by-Step.docx
@@ -1254,6 +1254,280 @@
         <w:t>La URI nip.io es temporal y depende de la IP pública/elástica de la instancia. Para un despliegue real se recomienda dominio propio, HTTPS con certificado administrado, API Gateway con JWT Authorizer y rotación de secretos. La validación descrita corresponde al alcance académico operativo.</w:t>
       </w:r>
     </w:p>
+    <w:p>
+      <w:pPr>
+        <w:pStyle w:val="Heading1"/>
+        <w:spacing w:before="240" w:after="120"/>
+      </w:pPr>
+      <w:r>
+        <w:t>12. Galería de capturas: MSAL, JWT y reflejo en Nexo</w:t>
+      </w:r>
+    </w:p>
+    <w:p>
+      <w:r>
+        <w:t>Esta sección reúne únicamente capturas de la configuración y del comportamiento visible de la aplicación. El JWT completo no se muestra por seguridad: la evidencia se limita a la configuración del scope, la sesión autenticada y el resultado que Nexo recibe después de la validación.</w:t>
+      </w:r>
+    </w:p>
+    <w:p>
+      <w:pPr>
+        <w:jc w:val="center"/>
+      </w:pPr>
+      <w:r>
+        <w:drawing>
+          <wp:inline xmlns:a="http://schemas.openxmlformats.org/drawingml/2006/main" xmlns:pic="http://schemas.openxmlformats.org/drawingml/2006/picture">
+            <wp:extent cx="5897880" cy="5132790"/>
+            <wp:docPr id="8" name="Picture 8"/>
+            <wp:cNvGraphicFramePr>
+              <a:graphicFrameLocks noChangeAspect="1"/>
+            </wp:cNvGraphicFramePr>
+            <a:graphic>
+              <a:graphicData uri="http://schemas.openxmlformats.org/drawingml/2006/picture">
+                <pic:pic>
+                  <pic:nvPicPr>
+                    <pic:cNvPr id="0" name="01-nexo-frontend-overview.png"/>
+                    <pic:cNvPicPr/>
+                  </pic:nvPicPr>
+                  <pic:blipFill>
+                    <a:blip r:embed="rId9"/>
+                    <a:stretch>
+                      <a:fillRect/>
+                    </a:stretch>
+                  </pic:blipFill>
+                  <pic:spPr>
+                    <a:xfrm>
+                      <a:off x="0" y="0"/>
+                      <a:ext cx="5897880" cy="5132790"/>
+                    </a:xfrm>
+                    <a:prstGeom prst="rect"/>
+                  </pic:spPr>
+                </pic:pic>
+              </a:graphicData>
+            </a:graphic>
+          </wp:inline>
+        </w:drawing>
+      </w:r>
+    </w:p>
+    <w:p>
+      <w:pPr>
+        <w:jc w:val="center"/>
+      </w:pPr>
+      <w:r>
+        <w:rPr>
+          <w:i/>
+          <w:color w:val="595959"/>
+          <w:sz w:val="18"/>
+        </w:rPr>
+        <w:t>MSAL/Entra: registro Nexo Frontend activo, tenant y aplicación SPA configurada.</w:t>
+      </w:r>
+    </w:p>
+    <w:p>
+      <w:pPr>
+        <w:jc w:val="center"/>
+      </w:pPr>
+      <w:r>
+        <w:drawing>
+          <wp:inline xmlns:a="http://schemas.openxmlformats.org/drawingml/2006/main" xmlns:pic="http://schemas.openxmlformats.org/drawingml/2006/picture">
+            <wp:extent cx="5897880" cy="5132790"/>
+            <wp:docPr id="9" name="Picture 9"/>
+            <wp:cNvGraphicFramePr>
+              <a:graphicFrameLocks noChangeAspect="1"/>
+            </wp:cNvGraphicFramePr>
+            <a:graphic>
+              <a:graphicData uri="http://schemas.openxmlformats.org/drawingml/2006/picture">
+                <pic:pic>
+                  <pic:nvPicPr>
+                    <pic:cNvPr id="0" name="02-nexo-api-scope.png"/>
+                    <pic:cNvPicPr/>
+                  </pic:nvPicPr>
+                  <pic:blipFill>
+                    <a:blip r:embed="rId10"/>
+                    <a:stretch>
+                      <a:fillRect/>
+                    </a:stretch>
+                  </pic:blipFill>
+                  <pic:spPr>
+                    <a:xfrm>
+                      <a:off x="0" y="0"/>
+                      <a:ext cx="5897880" cy="5132790"/>
+                    </a:xfrm>
+                    <a:prstGeom prst="rect"/>
+                  </pic:spPr>
+                </pic:pic>
+              </a:graphicData>
+            </a:graphic>
+          </wp:inline>
+        </w:drawing>
+      </w:r>
+    </w:p>
+    <w:p>
+      <w:pPr>
+        <w:jc w:val="center"/>
+      </w:pPr>
+      <w:r>
+        <w:rPr>
+          <w:i/>
+          <w:color w:val="595959"/>
+          <w:sz w:val="18"/>
+        </w:rPr>
+        <w:t>JWT/claims: Nexo Web expone el scope access_as_user que se solicita al access token.</w:t>
+      </w:r>
+    </w:p>
+    <w:p>
+      <w:pPr>
+        <w:jc w:val="center"/>
+      </w:pPr>
+      <w:r>
+        <w:drawing>
+          <wp:inline xmlns:a="http://schemas.openxmlformats.org/drawingml/2006/main" xmlns:pic="http://schemas.openxmlformats.org/drawingml/2006/picture">
+            <wp:extent cx="5897880" cy="5132790"/>
+            <wp:docPr id="10" name="Picture 10"/>
+            <wp:cNvGraphicFramePr>
+              <a:graphicFrameLocks noChangeAspect="1"/>
+            </wp:cNvGraphicFramePr>
+            <a:graphic>
+              <a:graphicData uri="http://schemas.openxmlformats.org/drawingml/2006/picture">
+                <pic:pic>
+                  <pic:nvPicPr>
+                    <pic:cNvPr id="0" name="04-nexo-login-rendered.png"/>
+                    <pic:cNvPicPr/>
+                  </pic:nvPicPr>
+                  <pic:blipFill>
+                    <a:blip r:embed="rId12"/>
+                    <a:stretch>
+                      <a:fillRect/>
+                    </a:stretch>
+                  </pic:blipFill>
+                  <pic:spPr>
+                    <a:xfrm>
+                      <a:off x="0" y="0"/>
+                      <a:ext cx="5897880" cy="5132790"/>
+                    </a:xfrm>
+                    <a:prstGeom prst="rect"/>
+                  </pic:spPr>
+                </pic:pic>
+              </a:graphicData>
+            </a:graphic>
+          </wp:inline>
+        </w:drawing>
+      </w:r>
+    </w:p>
+    <w:p>
+      <w:pPr>
+        <w:jc w:val="center"/>
+      </w:pPr>
+      <w:r>
+        <w:rPr>
+          <w:i/>
+          <w:color w:val="595959"/>
+          <w:sz w:val="18"/>
+        </w:rPr>
+        <w:t>Aplicación: pantalla de acceso Nexo con el botón Continuar con Microsoft.</w:t>
+      </w:r>
+    </w:p>
+    <w:p>
+      <w:pPr>
+        <w:jc w:val="center"/>
+      </w:pPr>
+      <w:r>
+        <w:drawing>
+          <wp:inline xmlns:a="http://schemas.openxmlformats.org/drawingml/2006/main" xmlns:pic="http://schemas.openxmlformats.org/drawingml/2006/picture">
+            <wp:extent cx="5897880" cy="3316690"/>
+            <wp:docPr id="11" name="Picture 11"/>
+            <wp:cNvGraphicFramePr>
+              <a:graphicFrameLocks noChangeAspect="1"/>
+            </wp:cNvGraphicFramePr>
+            <a:graphic>
+              <a:graphicData uri="http://schemas.openxmlformats.org/drawingml/2006/picture">
+                <pic:pic>
+                  <pic:nvPicPr>
+                    <pic:cNvPr id="0" name="06-login-success.png"/>
+                    <pic:cNvPicPr/>
+                  </pic:nvPicPr>
+                  <pic:blipFill>
+                    <a:blip r:embed="rId14"/>
+                    <a:stretch>
+                      <a:fillRect/>
+                    </a:stretch>
+                  </pic:blipFill>
+                  <pic:spPr>
+                    <a:xfrm>
+                      <a:off x="0" y="0"/>
+                      <a:ext cx="5897880" cy="3316690"/>
+                    </a:xfrm>
+                    <a:prstGeom prst="rect"/>
+                  </pic:spPr>
+                </pic:pic>
+              </a:graphicData>
+            </a:graphic>
+          </wp:inline>
+        </w:drawing>
+      </w:r>
+    </w:p>
+    <w:p>
+      <w:pPr>
+        <w:jc w:val="center"/>
+      </w:pPr>
+      <w:r>
+        <w:rPr>
+          <w:i/>
+          <w:color w:val="595959"/>
+          <w:sz w:val="18"/>
+        </w:rPr>
+        <w:t>Aplicación: retorno autenticado a Nexo; la interfaz identifica la sesión con Microsoft Entra ID.</w:t>
+      </w:r>
+    </w:p>
+    <w:p>
+      <w:pPr>
+        <w:jc w:val="center"/>
+      </w:pPr>
+      <w:r>
+        <w:drawing>
+          <wp:inline xmlns:a="http://schemas.openxmlformats.org/drawingml/2006/main" xmlns:pic="http://schemas.openxmlformats.org/drawingml/2006/picture">
+            <wp:extent cx="5897880" cy="6990923"/>
+            <wp:docPr id="12" name="Picture 12"/>
+            <wp:cNvGraphicFramePr>
+              <a:graphicFrameLocks noChangeAspect="1"/>
+            </wp:cNvGraphicFramePr>
+            <a:graphic>
+              <a:graphicData uri="http://schemas.openxmlformats.org/drawingml/2006/picture">
+                <pic:pic>
+                  <pic:nvPicPr>
+                    <pic:cNvPr id="0" name="07-session-expired-msal.png"/>
+                    <pic:cNvPicPr/>
+                  </pic:nvPicPr>
+                  <pic:blipFill>
+                    <a:blip r:embed="rId15"/>
+                    <a:stretch>
+                      <a:fillRect/>
+                    </a:stretch>
+                  </pic:blipFill>
+                  <pic:spPr>
+                    <a:xfrm>
+                      <a:off x="0" y="0"/>
+                      <a:ext cx="5897880" cy="6990923"/>
+                    </a:xfrm>
+                    <a:prstGeom prst="rect"/>
+                  </pic:spPr>
+                </pic:pic>
+              </a:graphicData>
+            </a:graphic>
+          </wp:inline>
+        </w:drawing>
+      </w:r>
+    </w:p>
+    <w:p>
+      <w:pPr>
+        <w:jc w:val="center"/>
+      </w:pPr>
+      <w:r>
+        <w:rPr>
+          <w:i/>
+          <w:color w:val="595959"/>
+          <w:sz w:val="18"/>
+        </w:rPr>
+        <w:t>MSAL: estado visible cuando la sesión expira y Nexo solicita iniciar sesión nuevamente.</w:t>
+      </w:r>
+    </w:p>
     <w:sectPr>
       <w:footerReference w:type="default" r:id="rId16"/>
       <w:pgSz w:w="12240" w:h="15840"/>

</xml_diff>

<commit_message>
docs: explicar MSAL y agregar captura real
</commit_message>
<xml_diff>
--- a/docs/Nexo-Frontend-Azure-Step-by-Step.docx
+++ b/docs/Nexo-Frontend-Azure-Step-by-Step.docx
@@ -1275,8 +1275,60 @@
       <w:r>
         <w:drawing>
           <wp:inline xmlns:a="http://schemas.openxmlformats.org/drawingml/2006/main" xmlns:pic="http://schemas.openxmlformats.org/drawingml/2006/picture">
+            <wp:extent cx="5897880" cy="6666710"/>
+            <wp:docPr id="8" name="Picture 8"/>
+            <wp:cNvGraphicFramePr>
+              <a:graphicFrameLocks noChangeAspect="1"/>
+            </wp:cNvGraphicFramePr>
+            <a:graphic>
+              <a:graphicData uri="http://schemas.openxmlformats.org/drawingml/2006/picture">
+                <pic:pic>
+                  <pic:nvPicPr>
+                    <pic:cNvPr id="0" name="08-msal-microsoft-login-20260910.png"/>
+                    <pic:cNvPicPr/>
+                  </pic:nvPicPr>
+                  <pic:blipFill>
+                    <a:blip r:embed="rId16"/>
+                    <a:stretch>
+                      <a:fillRect/>
+                    </a:stretch>
+                  </pic:blipFill>
+                  <pic:spPr>
+                    <a:xfrm>
+                      <a:off x="0" y="0"/>
+                      <a:ext cx="5897880" cy="6666710"/>
+                    </a:xfrm>
+                    <a:prstGeom prst="rect"/>
+                  </pic:spPr>
+                </pic:pic>
+              </a:graphicData>
+            </a:graphic>
+          </wp:inline>
+        </w:drawing>
+      </w:r>
+    </w:p>
+    <w:p>
+      <w:pPr>
+        <w:jc w:val="center"/>
+      </w:pPr>
+      <w:r>
+        <w:rPr>
+          <w:i/>
+          <w:color w:val="595959"/>
+          <w:sz w:val="18"/>
+        </w:rPr>
+        <w:t>Captura nueva en vivo: pantalla de Microsoft Entra abierta por MSAL desde el botón institucional de Nexo.</w:t>
+      </w:r>
+    </w:p>
+    <w:p>
+      <w:pPr>
+        <w:jc w:val="center"/>
+      </w:pPr>
+      <w:r>
+        <w:drawing>
+          <wp:inline xmlns:a="http://schemas.openxmlformats.org/drawingml/2006/main" xmlns:pic="http://schemas.openxmlformats.org/drawingml/2006/picture">
             <wp:extent cx="5897880" cy="5132790"/>
-            <wp:docPr id="8" name="Picture 8"/>
+            <wp:docPr id="9" name="Picture 9"/>
             <wp:cNvGraphicFramePr>
               <a:graphicFrameLocks noChangeAspect="1"/>
             </wp:cNvGraphicFramePr>
@@ -1328,7 +1380,7 @@
         <w:drawing>
           <wp:inline xmlns:a="http://schemas.openxmlformats.org/drawingml/2006/main" xmlns:pic="http://schemas.openxmlformats.org/drawingml/2006/picture">
             <wp:extent cx="5897880" cy="5132790"/>
-            <wp:docPr id="9" name="Picture 9"/>
+            <wp:docPr id="10" name="Picture 10"/>
             <wp:cNvGraphicFramePr>
               <a:graphicFrameLocks noChangeAspect="1"/>
             </wp:cNvGraphicFramePr>
@@ -1380,7 +1432,7 @@
         <w:drawing>
           <wp:inline xmlns:a="http://schemas.openxmlformats.org/drawingml/2006/main" xmlns:pic="http://schemas.openxmlformats.org/drawingml/2006/picture">
             <wp:extent cx="5897880" cy="5132790"/>
-            <wp:docPr id="10" name="Picture 10"/>
+            <wp:docPr id="11" name="Picture 11"/>
             <wp:cNvGraphicFramePr>
               <a:graphicFrameLocks noChangeAspect="1"/>
             </wp:cNvGraphicFramePr>
@@ -1432,7 +1484,7 @@
         <w:drawing>
           <wp:inline xmlns:a="http://schemas.openxmlformats.org/drawingml/2006/main" xmlns:pic="http://schemas.openxmlformats.org/drawingml/2006/picture">
             <wp:extent cx="5897880" cy="3316690"/>
-            <wp:docPr id="11" name="Picture 11"/>
+            <wp:docPr id="12" name="Picture 12"/>
             <wp:cNvGraphicFramePr>
               <a:graphicFrameLocks noChangeAspect="1"/>
             </wp:cNvGraphicFramePr>
@@ -1484,7 +1536,7 @@
         <w:drawing>
           <wp:inline xmlns:a="http://schemas.openxmlformats.org/drawingml/2006/main" xmlns:pic="http://schemas.openxmlformats.org/drawingml/2006/picture">
             <wp:extent cx="5897880" cy="6990923"/>
-            <wp:docPr id="12" name="Picture 12"/>
+            <wp:docPr id="13" name="Picture 13"/>
             <wp:cNvGraphicFramePr>
               <a:graphicFrameLocks noChangeAspect="1"/>
             </wp:cNvGraphicFramePr>
@@ -1528,8 +1580,52 @@
         <w:t>MSAL: estado visible cuando la sesión expira y Nexo solicita iniciar sesión nuevamente.</w:t>
       </w:r>
     </w:p>
+    <w:p>
+      <w:pPr>
+        <w:pStyle w:val="Heading1"/>
+        <w:spacing w:before="240" w:after="120"/>
+      </w:pPr>
+      <w:r>
+        <w:t>13. Qué hace MSAL y cómo participa el JWT</w:t>
+      </w:r>
+    </w:p>
+    <w:p>
+      <w:r>
+        <w:t>1. MSAL es la biblioteca oficial de Microsoft para que la aplicación Angular delegue el inicio de sesión en Microsoft Entra ID. Nexo no recibe ni almacena la contraseña institucional.</w:t>
+      </w:r>
+    </w:p>
+    <w:p>
+      <w:r>
+        <w:t>2. Al pulsar Continuar con Microsoft, MSAL inicia Authorization Code + PKCE y abre la pantalla de Microsoft. La captura nueva muestra precisamente ese paso externo y seguro.</w:t>
+      </w:r>
+    </w:p>
+    <w:p>
+      <w:r>
+        <w:t>3. Después de autenticar al usuario, Microsoft redirige al redirect URI registrado de Nexo. MSAL procesa la respuesta, identifica la cuenta activa y conserva la sesión en su caché del navegador.</w:t>
+      </w:r>
+    </w:p>
+    <w:p>
+      <w:r>
+        <w:t>4. Cuando Nexo necesita consumir la API, MSAL intenta obtener silenciosamente un access token. Ese token es un JWT firmado por Microsoft y contiene claims como issuer, audience, expiración y scope.</w:t>
+      </w:r>
+    </w:p>
+    <w:p>
+      <w:r>
+        <w:t>5. El interceptor de Angular agrega Authorization: Bearer únicamente a las llamadas dirigidas a la API de Nexo. El frontend no decide permisos leyendo el token; el backend valida la firma con las claves JWK, issuer, audience, expiración y scopes.</w:t>
+      </w:r>
+    </w:p>
+    <w:p>
+      <w:r>
+        <w:t>6. Si todo es válido, Spring crea la identidad autenticada y Nexo refleja el resultado en /home mostrando el nombre y la etiqueta Microsoft Entra ID. Si la sesión expira, la interfaz solicita volver a iniciar sesión.</w:t>
+      </w:r>
+    </w:p>
+    <w:p>
+      <w:r>
+        <w:t>Regla de seguridad para las evidencias: nunca se captura el JWT completo, cookies, códigos de autorización, contraseñas ni client secrets. La imagen JWT/claims del informe muestra la configuración del scope que autoriza el token, y la captura autenticada muestra únicamente el resultado visible en la aplicación.</w:t>
+      </w:r>
+    </w:p>
     <w:sectPr>
-      <w:footerReference w:type="default" r:id="rId16"/>
+      <w:footerReference w:type="default" r:id="rId17"/>
       <w:pgSz w:w="12240" w:h="15840"/>
       <w:pgMar w:top="936" w:right="1080" w:bottom="936" w:left="1080" w:header="720" w:footer="720" w:gutter="0"/>
       <w:cols w:space="720"/>

</xml_diff>